<commit_message>
Tailor resumes for full stack, backend, data science and data engineering
Each family now leads with its own current vocabulary, backed by new
bullets in content.mjs and its own skills lines:
- full stack: typed TypeScript monorepo, AI chart builder, EdSpace
- backend (new): declarative workflow, reproducible answers, tracing,
  idempotency, strangler migration, SLOs
- data science (new): controlled experiments, conformal thresholds,
  QC audits, recommender and ranking results
- data engineering: S3 data lake, schema-inferring ingestion, lineage,
  silent row loss, reprocessing, data-quality gates
The general resume follows the full-stack selection, as before. The AI
and ML resumes are unchanged.
</commit_message>
<xml_diff>
--- a/public/Archit_Agrawal_Resume.docx
+++ b/public/Archit_Agrawal_Resume.docx
@@ -239,106 +239,73 @@
           <w:szCs w:val="21"/>
           <w:color w:val="111111"/>
         </w:rPr>
-        <w:t xml:space="preserve">Own the software architecture and delivery of an AWS analytics platform for any structured dataset, spanning the web application, APIs and data pipelines.</w:t>
-      </w:r>
-    </w:p>
-    <w:p>
-      <w:pPr>
-        <w:spacing w:before="0" w:after="10" w:line="248" w:lineRule="exact"/>
-        <w:ind w:left="200" w:hanging="200"/>
-      </w:pPr>
-      <w:r>
-        <w:rPr>
-          <w:rFonts w:ascii="Lato" w:hAnsi="Lato" w:cs="Lato"/>
-          <w:sz w:val="21"/>
-          <w:szCs w:val="21"/>
-          <w:color w:val="111111"/>
-        </w:rPr>
-        <w:t xml:space="preserve">•</w:t>
-      </w:r>
-      <w:r>
-        <w:rPr>
-          <w:rFonts w:ascii="Lato" w:hAnsi="Lato" w:cs="Lato"/>
-          <w:sz w:val="21"/>
-          <w:szCs w:val="21"/>
-          <w:color w:val="111111"/>
-        </w:rPr>
-        <w:t xml:space="preserve">  </w:t>
-      </w:r>
-      <w:r>
-        <w:rPr>
-          <w:rFonts w:ascii="Lato" w:hAnsi="Lato" w:cs="Lato"/>
-          <w:sz w:val="21"/>
-          <w:szCs w:val="21"/>
-          <w:color w:val="111111"/>
-        </w:rPr>
-        <w:t xml:space="preserve">Built the platform's web application with a Nuxt frontend and NestJS backend, sharing TypeScript contracts across 70 API routes.</w:t>
-      </w:r>
-    </w:p>
-    <w:p>
-      <w:pPr>
-        <w:spacing w:before="0" w:after="10" w:line="248" w:lineRule="exact"/>
-        <w:ind w:left="200" w:hanging="200"/>
-      </w:pPr>
-      <w:r>
-        <w:rPr>
-          <w:rFonts w:ascii="Lato" w:hAnsi="Lato" w:cs="Lato"/>
-          <w:sz w:val="21"/>
-          <w:szCs w:val="21"/>
-          <w:color w:val="111111"/>
-        </w:rPr>
-        <w:t xml:space="preserve">•</w:t>
-      </w:r>
-      <w:r>
-        <w:rPr>
-          <w:rFonts w:ascii="Lato" w:hAnsi="Lato" w:cs="Lato"/>
-          <w:sz w:val="21"/>
-          <w:szCs w:val="21"/>
-          <w:color w:val="111111"/>
-        </w:rPr>
-        <w:t xml:space="preserve">  </w:t>
-      </w:r>
-      <w:r>
-        <w:rPr>
-          <w:rFonts w:ascii="Lato" w:hAnsi="Lato" w:cs="Lato"/>
-          <w:sz w:val="21"/>
-          <w:szCs w:val="21"/>
-          <w:color w:val="111111"/>
-        </w:rPr>
-        <w:t xml:space="preserve">Reduced AWS pipeline runtime from 500 to 85 seconds by replacing two managed-agent stages with direct tool calls.</w:t>
-      </w:r>
-    </w:p>
-    <w:p>
-      <w:pPr>
-        <w:spacing w:before="0" w:after="10" w:line="248" w:lineRule="exact"/>
-        <w:ind w:left="200" w:hanging="200"/>
-      </w:pPr>
-      <w:r>
-        <w:rPr>
-          <w:rFonts w:ascii="Lato" w:hAnsi="Lato" w:cs="Lato"/>
-          <w:sz w:val="21"/>
-          <w:szCs w:val="21"/>
-          <w:color w:val="111111"/>
-        </w:rPr>
-        <w:t xml:space="preserve">•</w:t>
-      </w:r>
-      <w:r>
-        <w:rPr>
-          <w:rFonts w:ascii="Lato" w:hAnsi="Lato" w:cs="Lato"/>
-          <w:sz w:val="21"/>
-          <w:szCs w:val="21"/>
-          <w:color w:val="111111"/>
-        </w:rPr>
-        <w:t xml:space="preserve">  </w:t>
-      </w:r>
-      <w:r>
-        <w:rPr>
-          <w:rFonts w:ascii="Lato" w:hAnsi="Lato" w:cs="Lato"/>
-          <w:sz w:val="21"/>
-          <w:szCs w:val="21"/>
-          <w:color w:val="111111"/>
-        </w:rPr>
-        <w:t xml:space="preserve">Parallelized data labeling across 64 AWS Step Functions lanes, with a failure circuit breaker to detect incomplete runs.</w:t>
+        <w:t xml:space="preserve">Own a full-stack TypeScript platform end to end: a 14-page Nuxt 4 frontend over a 10-module NestJS API sharing one typed contract, with 4,845 tests across 347k lines in 12 workspace packages.</w:t>
+      </w:r>
+    </w:p>
+    <w:p>
+      <w:pPr>
+        <w:spacing w:before="0" w:after="10" w:line="248" w:lineRule="exact"/>
+        <w:ind w:left="200" w:hanging="200"/>
+      </w:pPr>
+      <w:r>
+        <w:rPr>
+          <w:rFonts w:ascii="Lato" w:hAnsi="Lato" w:cs="Lato"/>
+          <w:sz w:val="21"/>
+          <w:szCs w:val="21"/>
+          <w:color w:val="111111"/>
+        </w:rPr>
+        <w:t xml:space="preserve">•</w:t>
+      </w:r>
+      <w:r>
+        <w:rPr>
+          <w:rFonts w:ascii="Lato" w:hAnsi="Lato" w:cs="Lato"/>
+          <w:sz w:val="21"/>
+          <w:szCs w:val="21"/>
+          <w:color w:val="111111"/>
+        </w:rPr>
+        <w:t xml:space="preserve">  </w:t>
+      </w:r>
+      <w:r>
+        <w:rPr>
+          <w:rFonts w:ascii="Lato" w:hAnsi="Lato" w:cs="Lato"/>
+          <w:sz w:val="21"/>
+          <w:szCs w:val="21"/>
+          <w:color w:val="111111"/>
+        </w:rPr>
+        <w:t xml:space="preserve">Shipped an AI chart builder: readers ask in plain English, get a Vega-Lite chart, then edit it with sort, stack, top-N, filters and undo/redo; every chart also ships an accessible data table and alt text.</w:t>
+      </w:r>
+    </w:p>
+    <w:p>
+      <w:pPr>
+        <w:spacing w:before="0" w:after="10" w:line="248" w:lineRule="exact"/>
+        <w:ind w:left="200" w:hanging="200"/>
+      </w:pPr>
+      <w:r>
+        <w:rPr>
+          <w:rFonts w:ascii="Lato" w:hAnsi="Lato" w:cs="Lato"/>
+          <w:sz w:val="21"/>
+          <w:szCs w:val="21"/>
+          <w:color w:val="111111"/>
+        </w:rPr>
+        <w:t xml:space="preserve">•</w:t>
+      </w:r>
+      <w:r>
+        <w:rPr>
+          <w:rFonts w:ascii="Lato" w:hAnsi="Lato" w:cs="Lato"/>
+          <w:sz w:val="21"/>
+          <w:szCs w:val="21"/>
+          <w:color w:val="111111"/>
+        </w:rPr>
+        <w:t xml:space="preserve">  </w:t>
+      </w:r>
+      <w:r>
+        <w:rPr>
+          <w:rFonts w:ascii="Lato" w:hAnsi="Lato" w:cs="Lato"/>
+          <w:sz w:val="21"/>
+          <w:szCs w:val="21"/>
+          <w:color w:val="111111"/>
+        </w:rPr>
+        <w:t xml:space="preserve">Built EdSpace in two days for the EdPlus hackathon: a live office map with room booking, desk claiming, walking routes and 3D desks, shown to leadership up to the CEO and going live for 500+ people.</w:t>
       </w:r>
     </w:p>
     <w:p>
@@ -501,39 +468,6 @@
           <w:szCs w:val="21"/>
           <w:color w:val="111111"/>
         </w:rPr>
-        <w:t xml:space="preserve">Scaled ingestion to 70,000+ records daily from 650+ venues using Playwright, transactional locking and entity resolution.</w:t>
-      </w:r>
-    </w:p>
-    <w:p>
-      <w:pPr>
-        <w:spacing w:before="0" w:after="10" w:line="248" w:lineRule="exact"/>
-        <w:ind w:left="200" w:hanging="200"/>
-      </w:pPr>
-      <w:r>
-        <w:rPr>
-          <w:rFonts w:ascii="Lato" w:hAnsi="Lato" w:cs="Lato"/>
-          <w:sz w:val="21"/>
-          <w:szCs w:val="21"/>
-          <w:color w:val="111111"/>
-        </w:rPr>
-        <w:t xml:space="preserve">•</w:t>
-      </w:r>
-      <w:r>
-        <w:rPr>
-          <w:rFonts w:ascii="Lato" w:hAnsi="Lato" w:cs="Lato"/>
-          <w:sz w:val="21"/>
-          <w:szCs w:val="21"/>
-          <w:color w:val="111111"/>
-        </w:rPr>
-        <w:t xml:space="preserve">  </w:t>
-      </w:r>
-      <w:r>
-        <w:rPr>
-          <w:rFonts w:ascii="Lato" w:hAnsi="Lato" w:cs="Lato"/>
-          <w:sz w:val="21"/>
-          <w:szCs w:val="21"/>
-          <w:color w:val="111111"/>
-        </w:rPr>
         <w:t xml:space="preserve">Consolidated a 14-Cloud-Function backend into a checkpointed Python/LangGraph workflow on GCP Cloud Run, reducing production service dependencies 64%.</w:t>
       </w:r>
     </w:p>
@@ -697,40 +631,7 @@
           <w:szCs w:val="21"/>
           <w:color w:val="111111"/>
         </w:rPr>
-        <w:t xml:space="preserve">Implemented tenant isolation in retrieval services and configuration-based onboarding for additional colleges.</w:t>
-      </w:r>
-    </w:p>
-    <w:p>
-      <w:pPr>
-        <w:spacing w:before="0" w:after="10" w:line="248" w:lineRule="exact"/>
-        <w:ind w:left="200" w:hanging="200"/>
-      </w:pPr>
-      <w:r>
-        <w:rPr>
-          <w:rFonts w:ascii="Lato" w:hAnsi="Lato" w:cs="Lato"/>
-          <w:sz w:val="21"/>
-          <w:szCs w:val="21"/>
-          <w:color w:val="111111"/>
-        </w:rPr>
-        <w:t xml:space="preserve">•</w:t>
-      </w:r>
-      <w:r>
-        <w:rPr>
-          <w:rFonts w:ascii="Lato" w:hAnsi="Lato" w:cs="Lato"/>
-          <w:sz w:val="21"/>
-          <w:szCs w:val="21"/>
-          <w:color w:val="111111"/>
-        </w:rPr>
-        <w:t xml:space="preserve">  </w:t>
-      </w:r>
-      <w:r>
-        <w:rPr>
-          <w:rFonts w:ascii="Lato" w:hAnsi="Lato" w:cs="Lato"/>
-          <w:sz w:val="21"/>
-          <w:szCs w:val="21"/>
-          <w:color w:val="111111"/>
-        </w:rPr>
-        <w:t xml:space="preserve">Cut transcript-analysis time from four hours to 15 minutes with a Neo4j knowledge graph and schema-validated, LLM-generated Cypher queries.</w:t>
+        <w:t xml:space="preserve">Built REST APIs and SQL-backed admin tools for ASU Online quiz platforms and question banks, with schema-level invariants protecting assessment integrity.</w:t>
       </w:r>
     </w:p>
     <w:p>
@@ -957,73 +858,40 @@
           <w:szCs w:val="21"/>
           <w:color w:val="111111"/>
         </w:rPr>
+        <w:t xml:space="preserve">Built React and Redux apps with normalized client state and typed REST integration, raising measured UX scores 40%.</w:t>
+      </w:r>
+    </w:p>
+    <w:p>
+      <w:pPr>
+        <w:spacing w:before="0" w:after="10" w:line="248" w:lineRule="exact"/>
+        <w:ind w:left="200" w:hanging="200"/>
+      </w:pPr>
+      <w:r>
+        <w:rPr>
+          <w:rFonts w:ascii="Lato" w:hAnsi="Lato" w:cs="Lato"/>
+          <w:sz w:val="21"/>
+          <w:szCs w:val="21"/>
+          <w:color w:val="111111"/>
+        </w:rPr>
+        <w:t xml:space="preserve">•</w:t>
+      </w:r>
+      <w:r>
+        <w:rPr>
+          <w:rFonts w:ascii="Lato" w:hAnsi="Lato" w:cs="Lato"/>
+          <w:sz w:val="21"/>
+          <w:szCs w:val="21"/>
+          <w:color w:val="111111"/>
+        </w:rPr>
+        <w:t xml:space="preserve">  </w:t>
+      </w:r>
+      <w:r>
+        <w:rPr>
+          <w:rFonts w:ascii="Lato" w:hAnsi="Lato" w:cs="Lato"/>
+          <w:sz w:val="21"/>
+          <w:szCs w:val="21"/>
+          <w:color w:val="111111"/>
+        </w:rPr>
         <w:t xml:space="preserve">Migrated a C#/.NET monolith to Dockerized Kubernetes microservices, reducing infrastructure cost 20% and resource footprint 35%.</w:t>
-      </w:r>
-    </w:p>
-    <w:p>
-      <w:pPr>
-        <w:spacing w:before="0" w:after="10" w:line="248" w:lineRule="exact"/>
-        <w:ind w:left="200" w:hanging="200"/>
-      </w:pPr>
-      <w:r>
-        <w:rPr>
-          <w:rFonts w:ascii="Lato" w:hAnsi="Lato" w:cs="Lato"/>
-          <w:sz w:val="21"/>
-          <w:szCs w:val="21"/>
-          <w:color w:val="111111"/>
-        </w:rPr>
-        <w:t xml:space="preserve">•</w:t>
-      </w:r>
-      <w:r>
-        <w:rPr>
-          <w:rFonts w:ascii="Lato" w:hAnsi="Lato" w:cs="Lato"/>
-          <w:sz w:val="21"/>
-          <w:szCs w:val="21"/>
-          <w:color w:val="111111"/>
-        </w:rPr>
-        <w:t xml:space="preserve">  </w:t>
-      </w:r>
-      <w:r>
-        <w:rPr>
-          <w:rFonts w:ascii="Lato" w:hAnsi="Lato" w:cs="Lato"/>
-          <w:sz w:val="21"/>
-          <w:szCs w:val="21"/>
-          <w:color w:val="111111"/>
-        </w:rPr>
-        <w:t xml:space="preserve">Reduced deployment time 70% and production incidents 40% through containerized CI/CD and SonarQube quality gates.</w:t>
-      </w:r>
-    </w:p>
-    <w:p>
-      <w:pPr>
-        <w:spacing w:before="0" w:after="10" w:line="248" w:lineRule="exact"/>
-        <w:ind w:left="200" w:hanging="200"/>
-      </w:pPr>
-      <w:r>
-        <w:rPr>
-          <w:rFonts w:ascii="Lato" w:hAnsi="Lato" w:cs="Lato"/>
-          <w:sz w:val="21"/>
-          <w:szCs w:val="21"/>
-          <w:color w:val="111111"/>
-        </w:rPr>
-        <w:t xml:space="preserve">•</w:t>
-      </w:r>
-      <w:r>
-        <w:rPr>
-          <w:rFonts w:ascii="Lato" w:hAnsi="Lato" w:cs="Lato"/>
-          <w:sz w:val="21"/>
-          <w:szCs w:val="21"/>
-          <w:color w:val="111111"/>
-        </w:rPr>
-        <w:t xml:space="preserve">  </w:t>
-      </w:r>
-      <w:r>
-        <w:rPr>
-          <w:rFonts w:ascii="Lato" w:hAnsi="Lato" w:cs="Lato"/>
-          <w:sz w:val="21"/>
-          <w:szCs w:val="21"/>
-          <w:color w:val="111111"/>
-        </w:rPr>
-        <w:t xml:space="preserve">Built a Redis-backed desk-booking service used across 300+ offices at Fortune 500 companies.</w:t>
       </w:r>
     </w:p>
     <w:p>
@@ -1042,6 +910,90 @@
           <w:b/>
           <w:color w:val="111111"/>
         </w:rPr>
+        <w:t xml:space="preserve">PROJECTS</w:t>
+      </w:r>
+    </w:p>
+    <w:p>
+      <w:pPr>
+        <w:keepNext/>
+        <w:tabs>
+          <w:tab w:val="right" w:pos="10656"/>
+        </w:tabs>
+        <w:spacing w:before="60" w:after="0" w:line="248" w:lineRule="exact"/>
+      </w:pPr>
+      <w:r>
+        <w:rPr>
+          <w:rFonts w:ascii="Lato" w:hAnsi="Lato" w:cs="Lato"/>
+          <w:sz w:val="21"/>
+          <w:szCs w:val="21"/>
+          <w:b/>
+          <w:color w:val="111111"/>
+        </w:rPr>
+        <w:t xml:space="preserve">PrismSplit</w:t>
+      </w:r>
+      <w:r>
+        <w:tab/>
+      </w:r>
+      <w:r>
+        <w:rPr>
+          <w:rFonts w:ascii="Lato" w:hAnsi="Lato" w:cs="Lato"/>
+          <w:sz w:val="21"/>
+          <w:szCs w:val="21"/>
+          <w:b/>
+          <w:color w:val="111111"/>
+        </w:rPr>
+        <w:t xml:space="preserve">2025 - Present</w:t>
+      </w:r>
+    </w:p>
+    <w:p>
+      <w:pPr>
+        <w:spacing w:before="0" w:after="10" w:line="248" w:lineRule="exact"/>
+        <w:ind w:left="200" w:hanging="200"/>
+      </w:pPr>
+      <w:r>
+        <w:rPr>
+          <w:rFonts w:ascii="Lato" w:hAnsi="Lato" w:cs="Lato"/>
+          <w:sz w:val="21"/>
+          <w:szCs w:val="21"/>
+          <w:color w:val="111111"/>
+        </w:rPr>
+        <w:t xml:space="preserve">•</w:t>
+      </w:r>
+      <w:r>
+        <w:rPr>
+          <w:rFonts w:ascii="Lato" w:hAnsi="Lato" w:cs="Lato"/>
+          <w:sz w:val="21"/>
+          <w:szCs w:val="21"/>
+          <w:color w:val="111111"/>
+        </w:rPr>
+        <w:t xml:space="preserve">  </w:t>
+      </w:r>
+      <w:r>
+        <w:rPr>
+          <w:rFonts w:ascii="Lato" w:hAnsi="Lato" w:cs="Lato"/>
+          <w:sz w:val="21"/>
+          <w:szCs w:val="21"/>
+          <w:color w:val="111111"/>
+        </w:rPr>
+        <w:t xml:space="preserve">Built a TypeScript/React Native expense app with transactional PostgreSQL billing and settlement, integer-cent accounting and offline write persistence.</w:t>
+      </w:r>
+    </w:p>
+    <w:p>
+      <w:pPr>
+        <w:keepNext/>
+        <w:pBdr>
+          <w:bottom w:val="single" w:sz="4" w:space="1" w:color="999999"/>
+        </w:pBdr>
+        <w:spacing w:before="120" w:after="40" w:line="240" w:lineRule="auto"/>
+      </w:pPr>
+      <w:r>
+        <w:rPr>
+          <w:rFonts w:ascii="Lato" w:hAnsi="Lato" w:cs="Lato"/>
+          <w:sz w:val="22"/>
+          <w:szCs w:val="22"/>
+          <w:b/>
+          <w:color w:val="111111"/>
+        </w:rPr>
         <w:t xml:space="preserve">TECHNICAL SKILLS</w:t>
       </w:r>
     </w:p>
@@ -1066,55 +1018,79 @@
           <w:szCs w:val="21"/>
           <w:color w:val="111111"/>
         </w:rPr>
-        <w:t xml:space="preserve">Python, TypeScript, JavaScript, SQL, C#</w:t>
-      </w:r>
-    </w:p>
-    <w:p>
-      <w:pPr>
-        <w:spacing w:before="0" w:after="10" w:line="248" w:lineRule="exact"/>
-      </w:pPr>
-      <w:r>
-        <w:rPr>
-          <w:rFonts w:ascii="Lato" w:hAnsi="Lato" w:cs="Lato"/>
-          <w:sz w:val="21"/>
-          <w:szCs w:val="21"/>
-          <w:b/>
-          <w:color w:val="111111"/>
-        </w:rPr>
-        <w:t xml:space="preserve">Web &amp; Data: </w:t>
-      </w:r>
-      <w:r>
-        <w:rPr>
-          <w:rFonts w:ascii="Lato" w:hAnsi="Lato" w:cs="Lato"/>
-          <w:sz w:val="21"/>
-          <w:szCs w:val="21"/>
-          <w:color w:val="111111"/>
-        </w:rPr>
-        <w:t xml:space="preserve">React, Nuxt, NestJS, FastAPI, .NET, PostgreSQL, Redis</w:t>
-      </w:r>
-    </w:p>
-    <w:p>
-      <w:pPr>
-        <w:spacing w:before="0" w:after="10" w:line="248" w:lineRule="exact"/>
-      </w:pPr>
-      <w:r>
-        <w:rPr>
-          <w:rFonts w:ascii="Lato" w:hAnsi="Lato" w:cs="Lato"/>
-          <w:sz w:val="21"/>
-          <w:szCs w:val="21"/>
-          <w:b/>
-          <w:color w:val="111111"/>
-        </w:rPr>
-        <w:t xml:space="preserve">Cloud &amp; Quality: </w:t>
-      </w:r>
-      <w:r>
-        <w:rPr>
-          <w:rFonts w:ascii="Lato" w:hAnsi="Lato" w:cs="Lato"/>
-          <w:sz w:val="21"/>
-          <w:szCs w:val="21"/>
-          <w:color w:val="111111"/>
-        </w:rPr>
-        <w:t xml:space="preserve">AWS, GCP, Docker, Kubernetes, CI/CD, pytest, Jest</w:t>
+        <w:t xml:space="preserve">TypeScript, JavaScript, Python, SQL, C#</w:t>
+      </w:r>
+    </w:p>
+    <w:p>
+      <w:pPr>
+        <w:spacing w:before="0" w:after="10" w:line="248" w:lineRule="exact"/>
+      </w:pPr>
+      <w:r>
+        <w:rPr>
+          <w:rFonts w:ascii="Lato" w:hAnsi="Lato" w:cs="Lato"/>
+          <w:sz w:val="21"/>
+          <w:szCs w:val="21"/>
+          <w:b/>
+          <w:color w:val="111111"/>
+        </w:rPr>
+        <w:t xml:space="preserve">Frontend: </w:t>
+      </w:r>
+      <w:r>
+        <w:rPr>
+          <w:rFonts w:ascii="Lato" w:hAnsi="Lato" w:cs="Lato"/>
+          <w:sz w:val="21"/>
+          <w:szCs w:val="21"/>
+          <w:color w:val="111111"/>
+        </w:rPr>
+        <w:t xml:space="preserve">React, Next.js, Vue/Nuxt, React Native, Redux, Material UI, Vega-Lite</w:t>
+      </w:r>
+    </w:p>
+    <w:p>
+      <w:pPr>
+        <w:spacing w:before="0" w:after="10" w:line="248" w:lineRule="exact"/>
+      </w:pPr>
+      <w:r>
+        <w:rPr>
+          <w:rFonts w:ascii="Lato" w:hAnsi="Lato" w:cs="Lato"/>
+          <w:sz w:val="21"/>
+          <w:szCs w:val="21"/>
+          <w:b/>
+          <w:color w:val="111111"/>
+        </w:rPr>
+        <w:t xml:space="preserve">Backend &amp; Data: </w:t>
+      </w:r>
+      <w:r>
+        <w:rPr>
+          <w:rFonts w:ascii="Lato" w:hAnsi="Lato" w:cs="Lato"/>
+          <w:sz w:val="21"/>
+          <w:szCs w:val="21"/>
+          <w:color w:val="111111"/>
+        </w:rPr>
+        <w:t xml:space="preserve">Node.js, NestJS, FastAPI, Express, .NET, REST, WebSockets, PostgreSQL, Redis, DuckDB</w:t>
+      </w:r>
+    </w:p>
+    <w:p>
+      <w:pPr>
+        <w:spacing w:before="0" w:after="10" w:line="248" w:lineRule="exact"/>
+      </w:pPr>
+      <w:r>
+        <w:rPr>
+          <w:rFonts w:ascii="Lato" w:hAnsi="Lato" w:cs="Lato"/>
+          <w:sz w:val="21"/>
+          <w:szCs w:val="21"/>
+          <w:b/>
+          <w:color w:val="111111"/>
+        </w:rPr>
+        <w:t xml:space="preserve">Cloud &amp; Testing: </w:t>
+      </w:r>
+      <w:r>
+        <w:rPr>
+          <w:rFonts w:ascii="Lato" w:hAnsi="Lato" w:cs="Lato"/>
+          <w:sz w:val="21"/>
+          <w:szCs w:val="21"/>
+          <w:color w:val="111111"/>
+        </w:rPr>
+        <w:t xml:space="preserve">AWS, GCP Cloud Run, Docker, Kubernetes, CI/CD, Vitest, Jest, React Testing Library, pytest</w:t>
       </w:r>
     </w:p>
     <w:p>

</xml_diff>